<commit_message>
module 4 non IT : cas réel de référence inventée et prérequis allégés
- Deck : diapo 10 « Cité pour un article qu'il n'a jamais écrit » (cas Dr Tiebekabe, avec son accord)
- Guide formateur : numéros de diapos recalés, cas ajouté au conducteur T1
- Chronogramme : prérequis limités aux compétences, au matériel et aux comptes

Co-Authored-By: Claude Opus 5.5 <noreply@anthropic.com>
</commit_message>
<xml_diff>
--- a/module4_nonIT/M4-nonIT_Chronogramme_et_prerequis.docx
+++ b/module4_nonIT/M4-nonIT_Chronogramme_et_prerequis.docx
@@ -2624,23 +2624,6 @@
               <w:t xml:space="preserve"> (Chrome, Edge ou Firefox) ; Word ou Google Docs.</w:t>
             </w:r>
           </w:p>
-          <w:p>
-            <w:pPr>
-              <w:spacing w:after="20" w:line="228" w:lineRule="auto"/>
-              <w:ind w:left="180" w:hanging="180"/>
-            </w:pPr>
-            <w:r>
-              <w:rPr>
-                <w:b/>
-                <w:bCs/>
-                <w:color w:val="E0A526"/>
-              </w:rPr>
-              <w:t xml:space="preserve">•  </w:t>
-            </w:r>
-            <w:r>
-              <w:t>Connexion internet : le Wi-Fi de l'UniPod ; un partage 4G est utile en secours.</w:t>
-            </w:r>
-          </w:p>
         </w:tc>
         <w:tc>
           <w:tcPr>
@@ -2781,237 +2764,6 @@
             </w:r>
             <w:r>
               <w:t>Vérifier la veille que chaque compte s'ouvre bien (mot de passe noté).</w:t>
-            </w:r>
-          </w:p>
-        </w:tc>
-      </w:tr>
-      <w:tr>
-        <w:tblPrEx>
-          <w:tblCellMar>
-            <w:top w:w="0" w:type="dxa"/>
-            <w:bottom w:w="0" w:type="dxa"/>
-          </w:tblCellMar>
-        </w:tblPrEx>
-        <w:tc>
-          <w:tcPr>
-            <w:tcW w:w="5386" w:type="dxa"/>
-            <w:tcBorders>
-              <w:top w:val="single" w:sz="4" w:space="0" w:color="B9C9CC"/>
-              <w:left w:val="single" w:sz="4" w:space="0" w:color="B9C9CC"/>
-              <w:bottom w:val="single" w:sz="4" w:space="0" w:color="B9C9CC"/>
-              <w:right w:val="single" w:sz="4" w:space="0" w:color="B9C9CC"/>
-            </w:tcBorders>
-            <w:shd w:val="clear" w:color="auto" w:fill="FDF3DC"/>
-            <w:tcMar>
-              <w:top w:w="60" w:type="dxa"/>
-              <w:left w:w="120" w:type="dxa"/>
-              <w:bottom w:w="60" w:type="dxa"/>
-              <w:right w:w="120" w:type="dxa"/>
-            </w:tcMar>
-          </w:tcPr>
-          <w:p>
-            <w:pPr>
-              <w:spacing w:after="40"/>
-            </w:pPr>
-            <w:r>
-              <w:rPr>
-                <w:b/>
-                <w:bCs/>
-                <w:color w:val="0B3C49"/>
-                <w:sz w:val="17"/>
-                <w:szCs w:val="17"/>
-              </w:rPr>
-              <w:t>Documents à apporter (sur l'ordinateur)</w:t>
-            </w:r>
-          </w:p>
-          <w:p>
-            <w:pPr>
-              <w:spacing w:after="20" w:line="228" w:lineRule="auto"/>
-              <w:ind w:left="180" w:hanging="180"/>
-            </w:pPr>
-            <w:r>
-              <w:rPr>
-                <w:b/>
-                <w:bCs/>
-                <w:color w:val="E0A526"/>
-              </w:rPr>
-              <w:t xml:space="preserve">•  </w:t>
-            </w:r>
-            <w:r>
-              <w:rPr>
-                <w:b/>
-                <w:bCs/>
-              </w:rPr>
-              <w:t>Son domaine ou thème de thèse en une phrase</w:t>
-            </w:r>
-            <w:r>
-              <w:t xml:space="preserve"> et un article clé du sujet (Lab R)</w:t>
-            </w:r>
-          </w:p>
-          <w:p>
-            <w:pPr>
-              <w:spacing w:after="20" w:line="228" w:lineRule="auto"/>
-              <w:ind w:left="180" w:hanging="180"/>
-            </w:pPr>
-            <w:r>
-              <w:rPr>
-                <w:b/>
-                <w:bCs/>
-                <w:color w:val="E0A526"/>
-              </w:rPr>
-              <w:t xml:space="preserve">•  </w:t>
-            </w:r>
-            <w:r>
-              <w:rPr>
-                <w:b/>
-                <w:bCs/>
-              </w:rPr>
-              <w:t>Le résumé de sa thèse</w:t>
-            </w:r>
-            <w:r>
-              <w:t xml:space="preserve"> ou de son projet de thèse, et un paragraphe de l'état de l'art (Lab 1)</w:t>
-            </w:r>
-          </w:p>
-          <w:p>
-            <w:pPr>
-              <w:spacing w:after="20" w:line="228" w:lineRule="auto"/>
-              <w:ind w:left="180" w:hanging="180"/>
-            </w:pPr>
-            <w:r>
-              <w:rPr>
-                <w:b/>
-                <w:bCs/>
-                <w:color w:val="E0A526"/>
-              </w:rPr>
-              <w:t xml:space="preserve">•  </w:t>
-            </w:r>
-            <w:r>
-              <w:rPr>
-                <w:b/>
-                <w:bCs/>
-              </w:rPr>
-              <w:t>5 à 10 articles de sa bibliographie</w:t>
-            </w:r>
-            <w:r>
-              <w:t>, en PDF, en libre accès (Labs 2 et R)</w:t>
-            </w:r>
-          </w:p>
-          <w:p>
-            <w:pPr>
-              <w:spacing w:after="20" w:line="228" w:lineRule="auto"/>
-              <w:ind w:left="180" w:hanging="180"/>
-            </w:pPr>
-            <w:r>
-              <w:rPr>
-                <w:b/>
-                <w:bCs/>
-                <w:color w:val="E0A526"/>
-              </w:rPr>
-              <w:t xml:space="preserve">•  </w:t>
-            </w:r>
-            <w:r>
-              <w:t>Sans ces documents : un pack commun de 12 articles et des corpus fictifs sont fournis.</w:t>
-            </w:r>
-          </w:p>
-        </w:tc>
-        <w:tc>
-          <w:tcPr>
-            <w:tcW w:w="5386" w:type="dxa"/>
-            <w:tcBorders>
-              <w:top w:val="single" w:sz="4" w:space="0" w:color="B9C9CC"/>
-              <w:left w:val="single" w:sz="4" w:space="0" w:color="B9C9CC"/>
-              <w:bottom w:val="single" w:sz="4" w:space="0" w:color="B9C9CC"/>
-              <w:right w:val="single" w:sz="4" w:space="0" w:color="B9C9CC"/>
-            </w:tcBorders>
-            <w:shd w:val="clear" w:color="auto" w:fill="FBEDEA"/>
-            <w:tcMar>
-              <w:top w:w="60" w:type="dxa"/>
-              <w:left w:w="120" w:type="dxa"/>
-              <w:bottom w:w="60" w:type="dxa"/>
-              <w:right w:w="120" w:type="dxa"/>
-            </w:tcMar>
-          </w:tcPr>
-          <w:p>
-            <w:pPr>
-              <w:spacing w:after="40"/>
-            </w:pPr>
-            <w:r>
-              <w:rPr>
-                <w:b/>
-                <w:bCs/>
-                <w:color w:val="0B3C49"/>
-                <w:sz w:val="17"/>
-                <w:szCs w:val="17"/>
-              </w:rPr>
-              <w:t>À ne pas apporter</w:t>
-            </w:r>
-          </w:p>
-          <w:p>
-            <w:pPr>
-              <w:spacing w:after="20" w:line="228" w:lineRule="auto"/>
-              <w:ind w:left="180" w:hanging="180"/>
-            </w:pPr>
-            <w:r>
-              <w:rPr>
-                <w:b/>
-                <w:bCs/>
-                <w:color w:val="E0A526"/>
-              </w:rPr>
-              <w:t xml:space="preserve">•  </w:t>
-            </w:r>
-            <w:r>
-              <w:t>Données d'enquête ou de patients non anonymisées (entretiens, questionnaires nominatifs)</w:t>
-            </w:r>
-          </w:p>
-          <w:p>
-            <w:pPr>
-              <w:spacing w:after="20" w:line="228" w:lineRule="auto"/>
-              <w:ind w:left="180" w:hanging="180"/>
-            </w:pPr>
-            <w:r>
-              <w:rPr>
-                <w:b/>
-                <w:bCs/>
-                <w:color w:val="E0A526"/>
-              </w:rPr>
-              <w:t xml:space="preserve">•  </w:t>
-            </w:r>
-            <w:r>
-              <w:t>Chapitres de thèse inédits, sans l'accord de la direction de thèse</w:t>
-            </w:r>
-          </w:p>
-          <w:p>
-            <w:pPr>
-              <w:spacing w:after="20" w:line="228" w:lineRule="auto"/>
-              <w:ind w:left="180" w:hanging="180"/>
-            </w:pPr>
-            <w:r>
-              <w:rPr>
-                <w:b/>
-                <w:bCs/>
-                <w:color w:val="E0A526"/>
-              </w:rPr>
-              <w:t xml:space="preserve">•  </w:t>
-            </w:r>
-            <w:r>
-              <w:t>Documents confidentiels de laboratoire ou d'institution</w:t>
-            </w:r>
-          </w:p>
-          <w:p>
-            <w:pPr>
-              <w:spacing w:after="20" w:line="228" w:lineRule="auto"/>
-              <w:ind w:left="180" w:hanging="180"/>
-            </w:pPr>
-            <w:r>
-              <w:rPr>
-                <w:b/>
-                <w:bCs/>
-                <w:color w:val="E0A526"/>
-              </w:rPr>
-              <w:t xml:space="preserve">•  </w:t>
-            </w:r>
-            <w:r>
-              <w:t>Les labs utilisent des articles publiés, des textes personnels non sensibles et des corpus fictifs.</w:t>
             </w:r>
           </w:p>
         </w:tc>
@@ -3031,10 +2783,10 @@
 <file path=word/numbering.xml><?xml version="1.0" encoding="utf-8"?>
 <w:numbering xmlns:wpc="http://schemas.microsoft.com/office/word/2010/wordprocessingCanvas" xmlns:cx="http://schemas.microsoft.com/office/drawing/2014/chartex" xmlns:cx1="http://schemas.microsoft.com/office/drawing/2015/9/8/chartex" xmlns:cx2="http://schemas.microsoft.com/office/drawing/2015/10/21/chartex" xmlns:cx3="http://schemas.microsoft.com/office/drawing/2016/5/9/chartex" xmlns:cx4="http://schemas.microsoft.com/office/drawing/2016/5/10/chartex" xmlns:cx5="http://schemas.microsoft.com/office/drawing/2016/5/11/chartex" xmlns:cx6="http://schemas.microsoft.com/office/drawing/2016/5/12/chartex" xmlns:cx7="http://schemas.microsoft.com/office/drawing/2016/5/13/chartex" xmlns:cx8="http://schemas.microsoft.com/office/drawing/2016/5/14/chartex" xmlns:mc="http://schemas.openxmlformats.org/markup-compatibility/2006" xmlns:aink="http://schemas.microsoft.com/office/drawing/2016/ink" xmlns:am3d="http://schemas.microsoft.com/office/drawing/2017/model3d" xmlns:o="urn:schemas-microsoft-com:office:office" xmlns:oel="http://schemas.microsoft.com/office/2019/extlst" xmlns:r="http://schemas.openxmlformats.org/officeDocument/2006/relationships" xmlns:m="http://schemas.openxmlformats.org/officeDocument/2006/math" xmlns:v="urn:schemas-microsoft-com:vml" xmlns:wp14="http://schemas.microsoft.com/office/word/2010/wordprocessingDrawing" xmlns:wp="http://schemas.openxmlformats.org/drawingml/2006/wordprocessingDrawing" xmlns:w10="urn:schemas-microsoft-com:office:word" xmlns:w="http://schemas.openxmlformats.org/wordprocessingml/2006/main" xmlns:w14="http://schemas.microsoft.com/office/word/2010/wordml" xmlns:w15="http://schemas.microsoft.com/office/word/2012/wordml" xmlns:w16cex="http://schemas.microsoft.com/office/word/2018/wordml/cex" xmlns:w16cid="http://schemas.microsoft.com/office/word/2016/wordml/cid" xmlns:w16="http://schemas.microsoft.com/office/word/2018/wordml" xmlns:w16du="http://schemas.microsoft.com/office/word/2023/wordml/word16du" xmlns:w16sdtdh="http://schemas.microsoft.com/office/word/2020/wordml/sdtdatahash" xmlns:w16sdtfl="http://schemas.microsoft.com/office/word/2024/wordml/sdtformatlock" xmlns:w16se="http://schemas.microsoft.com/office/word/2015/wordml/symex" xmlns:wpg="http://schemas.microsoft.com/office/word/2010/wordprocessingGroup" xmlns:wpi="http://schemas.microsoft.com/office/word/2010/wordprocessingInk" xmlns:wne="http://schemas.microsoft.com/office/word/2006/wordml" xmlns:wps="http://schemas.microsoft.com/office/word/2010/wordprocessingShape" mc:Ignorable="w14 w15 w16se w16cid w16 w16cex w16sdtdh w16sdtfl w16du wp14">
   <w:abstractNum w:abstractNumId="0" w15:restartNumberingAfterBreak="0">
-    <w:nsid w:val="2B562A79"/>
+    <w:nsid w:val="0B8A70F0"/>
     <w:multiLevelType w:val="hybridMultilevel"/>
-    <w:tmpl w:val="7A36D788"/>
-    <w:lvl w:ilvl="0" w:tplc="F4B2EF5A">
+    <w:tmpl w:val="C8727BA8"/>
+    <w:lvl w:ilvl="0" w:tplc="601EEE4C">
       <w:start w:val="1"/>
       <w:numFmt w:val="bullet"/>
       <w:lvlText w:val="●"/>
@@ -3043,7 +2795,7 @@
         <w:ind w:left="720" w:hanging="360"/>
       </w:pPr>
     </w:lvl>
-    <w:lvl w:ilvl="1" w:tplc="D2B884BE">
+    <w:lvl w:ilvl="1" w:tplc="9D26682A">
       <w:start w:val="1"/>
       <w:numFmt w:val="bullet"/>
       <w:lvlText w:val="○"/>
@@ -3052,7 +2804,7 @@
         <w:ind w:left="1440" w:hanging="360"/>
       </w:pPr>
     </w:lvl>
-    <w:lvl w:ilvl="2" w:tplc="E86AE382">
+    <w:lvl w:ilvl="2" w:tplc="B3AC48D8">
       <w:start w:val="1"/>
       <w:numFmt w:val="bullet"/>
       <w:lvlText w:val="■"/>
@@ -3061,7 +2813,7 @@
         <w:ind w:left="2160" w:hanging="360"/>
       </w:pPr>
     </w:lvl>
-    <w:lvl w:ilvl="3" w:tplc="707E2308">
+    <w:lvl w:ilvl="3" w:tplc="D64E313E">
       <w:start w:val="1"/>
       <w:numFmt w:val="bullet"/>
       <w:lvlText w:val="●"/>
@@ -3070,7 +2822,7 @@
         <w:ind w:left="2880" w:hanging="360"/>
       </w:pPr>
     </w:lvl>
-    <w:lvl w:ilvl="4" w:tplc="368CF0E6">
+    <w:lvl w:ilvl="4" w:tplc="6BAE677A">
       <w:start w:val="1"/>
       <w:numFmt w:val="bullet"/>
       <w:lvlText w:val="○"/>
@@ -3079,7 +2831,7 @@
         <w:ind w:left="3600" w:hanging="360"/>
       </w:pPr>
     </w:lvl>
-    <w:lvl w:ilvl="5" w:tplc="3BDA8B62">
+    <w:lvl w:ilvl="5" w:tplc="4C3A9D7C">
       <w:start w:val="1"/>
       <w:numFmt w:val="bullet"/>
       <w:lvlText w:val="■"/>
@@ -3088,7 +2840,7 @@
         <w:ind w:left="4320" w:hanging="360"/>
       </w:pPr>
     </w:lvl>
-    <w:lvl w:ilvl="6" w:tplc="917A970E">
+    <w:lvl w:ilvl="6" w:tplc="29286076">
       <w:start w:val="1"/>
       <w:numFmt w:val="bullet"/>
       <w:lvlText w:val="●"/>
@@ -3097,7 +2849,7 @@
         <w:ind w:left="5040" w:hanging="360"/>
       </w:pPr>
     </w:lvl>
-    <w:lvl w:ilvl="7" w:tplc="5B16C8BC">
+    <w:lvl w:ilvl="7" w:tplc="0EF638CC">
       <w:start w:val="1"/>
       <w:numFmt w:val="bullet"/>
       <w:lvlText w:val="●"/>
@@ -3106,7 +2858,7 @@
         <w:ind w:left="5760" w:hanging="360"/>
       </w:pPr>
     </w:lvl>
-    <w:lvl w:ilvl="8" w:tplc="68DE8B8E">
+    <w:lvl w:ilvl="8" w:tplc="4F7E193C">
       <w:start w:val="1"/>
       <w:numFmt w:val="bullet"/>
       <w:lvlText w:val="●"/>
@@ -3116,7 +2868,7 @@
       </w:pPr>
     </w:lvl>
   </w:abstractNum>
-  <w:num w:numId="1" w16cid:durableId="511532228">
+  <w:num w:numId="1" w16cid:durableId="1551719983">
     <w:abstractNumId w:val="0"/>
     <w:lvlOverride w:ilvl="0">
       <w:startOverride w:val="1"/>

</xml_diff>